<commit_message>
Update skill docx files
</commit_message>
<xml_diff>
--- a/SKILL-1.docx
+++ b/SKILL-1.docx
@@ -135,7 +135,7 @@
       </w:r>
     </w:p>
     <w:p>
-      <w:hyperlink r:id="rId5" w:history="1">
+      <w:hyperlink r:id="rId7" w:history="1">
         <w:r>
           <w:rPr>
             <w:rStyle w:val="Hyperlink"/>
@@ -300,26 +300,16 @@
         <w:t xml:space="preserve">        &lt;</w:t>
       </w:r>
       <w:proofErr w:type="spellStart"/>
-      <w:proofErr w:type="gramStart"/>
-      <w:r>
-        <w:t>maven.compiler</w:t>
-      </w:r>
-      <w:proofErr w:type="gramEnd"/>
-      <w:r>
-        <w:t>.release</w:t>
+      <w:r>
+        <w:t>maven.compiler.release</w:t>
       </w:r>
       <w:proofErr w:type="spellEnd"/>
       <w:r>
         <w:t>&gt;17&lt;/</w:t>
       </w:r>
       <w:proofErr w:type="spellStart"/>
-      <w:proofErr w:type="gramStart"/>
-      <w:r>
-        <w:t>maven.compiler</w:t>
-      </w:r>
-      <w:proofErr w:type="gramEnd"/>
-      <w:r>
-        <w:t>.release</w:t>
+      <w:r>
+        <w:t>maven.compiler.release</w:t>
       </w:r>
       <w:proofErr w:type="spellEnd"/>
       <w:r>
@@ -331,23 +321,7 @@
         <w:ind w:left="720"/>
       </w:pPr>
       <w:r>
-        <w:t xml:space="preserve">        &lt;</w:t>
-      </w:r>
-      <w:proofErr w:type="gramStart"/>
-      <w:r>
-        <w:t>project.build</w:t>
-      </w:r>
-      <w:proofErr w:type="gramEnd"/>
-      <w:r>
-        <w:t>.sourceEncoding&gt;UTF-8&lt;/</w:t>
-      </w:r>
-      <w:proofErr w:type="gramStart"/>
-      <w:r>
-        <w:t>project.build</w:t>
-      </w:r>
-      <w:proofErr w:type="gramEnd"/>
-      <w:r>
-        <w:t>.sourceEncoding&gt;</w:t>
+        <w:t xml:space="preserve">        &lt;project.build.sourceEncoding&gt;UTF-8&lt;/project.build.sourceEncoding&gt;</w:t>
       </w:r>
     </w:p>
     <w:p>
@@ -387,11 +361,7 @@
         <w:ind w:left="720"/>
       </w:pPr>
       <w:r>
-        <w:t xml:space="preserve">                </w:t>
-      </w:r>
-      <w:proofErr w:type="gramStart"/>
-      <w:r>
-        <w:t>&lt;</w:t>
+        <w:t xml:space="preserve">                &lt;</w:t>
       </w:r>
       <w:proofErr w:type="spellStart"/>
       <w:r>
@@ -403,11 +373,7 @@
       </w:r>
       <w:proofErr w:type="spellStart"/>
       <w:r>
-        <w:t>org.apache.maven</w:t>
-      </w:r>
-      <w:proofErr w:type="gramEnd"/>
-      <w:r>
-        <w:t>.plugins</w:t>
+        <w:t>org.apache.maven.plugins</w:t>
       </w:r>
       <w:proofErr w:type="spellEnd"/>
       <w:r>
@@ -475,11 +441,7 @@
         <w:ind w:left="720"/>
       </w:pPr>
       <w:r>
-        <w:t xml:space="preserve">                </w:t>
-      </w:r>
-      <w:proofErr w:type="gramStart"/>
-      <w:r>
-        <w:t>&lt;</w:t>
+        <w:t xml:space="preserve">                &lt;</w:t>
       </w:r>
       <w:proofErr w:type="spellStart"/>
       <w:r>
@@ -494,7 +456,6 @@
         <w:t>org.codehaus.mojo</w:t>
       </w:r>
       <w:proofErr w:type="spellEnd"/>
-      <w:proofErr w:type="gramEnd"/>
       <w:r>
         <w:t>&lt;/</w:t>
       </w:r>
@@ -552,6 +513,7 @@
         <w:ind w:left="720"/>
       </w:pPr>
       <w:r>
+        <w:lastRenderedPageBreak/>
         <w:t xml:space="preserve">                    &lt;</w:t>
       </w:r>
       <w:proofErr w:type="spellStart"/>
@@ -592,7 +554,6 @@
         <w:ind w:left="720"/>
       </w:pPr>
       <w:r>
-        <w:lastRenderedPageBreak/>
         <w:t xml:space="preserve">        &lt;/plugins&gt;</w:t>
       </w:r>
     </w:p>
@@ -613,7 +574,7 @@
       </w:r>
     </w:p>
     <w:p>
-      <w:hyperlink r:id="rId6" w:history="1">
+      <w:hyperlink r:id="rId8" w:history="1">
         <w:r>
           <w:rPr>
             <w:rStyle w:val="Hyperlink"/>
@@ -635,15 +596,7 @@
         <w:ind w:left="720"/>
       </w:pPr>
       <w:r>
-        <w:t xml:space="preserve">    public static void </w:t>
-      </w:r>
-      <w:proofErr w:type="gramStart"/>
-      <w:r>
-        <w:t>main(String[</w:t>
-      </w:r>
-      <w:proofErr w:type="gramEnd"/>
-      <w:r>
-        <w:t xml:space="preserve">] </w:t>
+        <w:t xml:space="preserve">    public static void main(String[] </w:t>
       </w:r>
       <w:proofErr w:type="spellStart"/>
       <w:r>
@@ -687,7 +640,7 @@
       </w:r>
     </w:p>
     <w:p>
-      <w:hyperlink r:id="rId7" w:history="1">
+      <w:hyperlink r:id="rId9" w:history="1">
         <w:r>
           <w:rPr>
             <w:rStyle w:val="Hyperlink"/>
@@ -747,7 +700,7 @@
       <w:r>
         <w:t>From project root </w:t>
       </w:r>
-      <w:hyperlink r:id="rId8" w:history="1">
+      <w:hyperlink r:id="rId10" w:history="1">
         <w:r>
           <w:rPr>
             <w:rStyle w:val="Hyperlink"/>
@@ -791,7 +744,7 @@
       <w:r>
         <w:t>From project root </w:t>
       </w:r>
-      <w:hyperlink r:id="rId9" w:history="1">
+      <w:hyperlink r:id="rId11" w:history="1">
         <w:r>
           <w:rPr>
             <w:rStyle w:val="Hyperlink"/>
@@ -891,7 +844,7 @@
       <w:r>
         <w:t>Added exec-maven-plugin so </w:t>
       </w:r>
-      <w:hyperlink r:id="rId10" w:history="1">
+      <w:hyperlink r:id="rId12" w:history="1">
         <w:r>
           <w:rPr>
             <w:rStyle w:val="Hyperlink"/>
@@ -913,7 +866,7 @@
       <w:r>
         <w:t>Implemented minimal </w:t>
       </w:r>
-      <w:hyperlink r:id="rId11" w:history="1">
+      <w:hyperlink r:id="rId13" w:history="1">
         <w:r>
           <w:rPr>
             <w:rStyle w:val="Hyperlink"/>
@@ -963,7 +916,7 @@
         </w:rPr>
         <w:lastRenderedPageBreak/>
         <w:drawing>
-          <wp:inline distT="0" distB="0" distL="0" distR="0" wp14:anchorId="00C223BC" wp14:editId="5AEB072F">
+          <wp:inline distT="0" distB="0" distL="0" distR="0" wp14:anchorId="00C223BC" wp14:editId="0441E668">
             <wp:extent cx="7020560" cy="3949065"/>
             <wp:effectExtent l="0" t="0" r="8890" b="0"/>
             <wp:docPr id="917278907" name="Picture 1"/>
@@ -978,7 +931,7 @@
                     <pic:cNvPicPr/>
                   </pic:nvPicPr>
                   <pic:blipFill>
-                    <a:blip r:embed="rId12" cstate="print">
+                    <a:blip r:embed="rId14" cstate="print">
                       <a:extLst>
                         <a:ext uri="{28A0092B-C50C-407E-A947-70E740481C1C}">
                           <a14:useLocalDpi xmlns:a14="http://schemas.microsoft.com/office/drawing/2010/main" val="0"/>
@@ -1009,7 +962,7 @@
           <w:noProof/>
         </w:rPr>
         <w:drawing>
-          <wp:inline distT="0" distB="0" distL="0" distR="0" wp14:anchorId="4CF4E0E8" wp14:editId="4AC74D3D">
+          <wp:inline distT="0" distB="0" distL="0" distR="0" wp14:anchorId="4CF4E0E8" wp14:editId="4CAF8303">
             <wp:extent cx="7020560" cy="3949065"/>
             <wp:effectExtent l="0" t="0" r="8890" b="0"/>
             <wp:docPr id="1040511483" name="Picture 2"/>
@@ -1021,99 +974,6 @@
                 <pic:pic xmlns:pic="http://schemas.openxmlformats.org/drawingml/2006/picture">
                   <pic:nvPicPr>
                     <pic:cNvPr id="1040511483" name="Picture 1040511483"/>
-                    <pic:cNvPicPr/>
-                  </pic:nvPicPr>
-                  <pic:blipFill>
-                    <a:blip r:embed="rId13" cstate="print">
-                      <a:extLst>
-                        <a:ext uri="{28A0092B-C50C-407E-A947-70E740481C1C}">
-                          <a14:useLocalDpi xmlns:a14="http://schemas.microsoft.com/office/drawing/2010/main" val="0"/>
-                        </a:ext>
-                      </a:extLst>
-                    </a:blip>
-                    <a:stretch>
-                      <a:fillRect/>
-                    </a:stretch>
-                  </pic:blipFill>
-                  <pic:spPr>
-                    <a:xfrm>
-                      <a:off x="0" y="0"/>
-                      <a:ext cx="7020560" cy="3949065"/>
-                    </a:xfrm>
-                    <a:prstGeom prst="rect">
-                      <a:avLst/>
-                    </a:prstGeom>
-                  </pic:spPr>
-                </pic:pic>
-              </a:graphicData>
-            </a:graphic>
-          </wp:inline>
-        </w:drawing>
-      </w:r>
-      <w:r>
-        <w:rPr>
-          <w:noProof/>
-        </w:rPr>
-        <w:lastRenderedPageBreak/>
-        <w:drawing>
-          <wp:inline distT="0" distB="0" distL="0" distR="0" wp14:anchorId="717C541C" wp14:editId="1A6648A3">
-            <wp:extent cx="7020560" cy="5735320"/>
-            <wp:effectExtent l="0" t="0" r="8890" b="0"/>
-            <wp:docPr id="1806271012" name="Picture 3"/>
-            <wp:cNvGraphicFramePr>
-              <a:graphicFrameLocks xmlns:a="http://schemas.openxmlformats.org/drawingml/2006/main" noChangeAspect="1"/>
-            </wp:cNvGraphicFramePr>
-            <a:graphic xmlns:a="http://schemas.openxmlformats.org/drawingml/2006/main">
-              <a:graphicData uri="http://schemas.openxmlformats.org/drawingml/2006/picture">
-                <pic:pic xmlns:pic="http://schemas.openxmlformats.org/drawingml/2006/picture">
-                  <pic:nvPicPr>
-                    <pic:cNvPr id="1806271012" name="Picture 1806271012"/>
-                    <pic:cNvPicPr/>
-                  </pic:nvPicPr>
-                  <pic:blipFill>
-                    <a:blip r:embed="rId14">
-                      <a:extLst>
-                        <a:ext uri="{28A0092B-C50C-407E-A947-70E740481C1C}">
-                          <a14:useLocalDpi xmlns:a14="http://schemas.microsoft.com/office/drawing/2010/main" val="0"/>
-                        </a:ext>
-                      </a:extLst>
-                    </a:blip>
-                    <a:stretch>
-                      <a:fillRect/>
-                    </a:stretch>
-                  </pic:blipFill>
-                  <pic:spPr>
-                    <a:xfrm>
-                      <a:off x="0" y="0"/>
-                      <a:ext cx="7020560" cy="5735320"/>
-                    </a:xfrm>
-                    <a:prstGeom prst="rect">
-                      <a:avLst/>
-                    </a:prstGeom>
-                  </pic:spPr>
-                </pic:pic>
-              </a:graphicData>
-            </a:graphic>
-          </wp:inline>
-        </w:drawing>
-      </w:r>
-      <w:r>
-        <w:rPr>
-          <w:noProof/>
-        </w:rPr>
-        <w:drawing>
-          <wp:inline distT="0" distB="0" distL="0" distR="0" wp14:anchorId="65A7E2FF" wp14:editId="7FA07C23">
-            <wp:extent cx="7020560" cy="3949065"/>
-            <wp:effectExtent l="0" t="0" r="8890" b="0"/>
-            <wp:docPr id="1111435175" name="Picture 4"/>
-            <wp:cNvGraphicFramePr>
-              <a:graphicFrameLocks xmlns:a="http://schemas.openxmlformats.org/drawingml/2006/main" noChangeAspect="1"/>
-            </wp:cNvGraphicFramePr>
-            <a:graphic xmlns:a="http://schemas.openxmlformats.org/drawingml/2006/main">
-              <a:graphicData uri="http://schemas.openxmlformats.org/drawingml/2006/picture">
-                <pic:pic xmlns:pic="http://schemas.openxmlformats.org/drawingml/2006/picture">
-                  <pic:nvPicPr>
-                    <pic:cNvPr id="1111435175" name="Picture 1111435175"/>
                     <pic:cNvPicPr/>
                   </pic:nvPicPr>
                   <pic:blipFill>
@@ -1149,10 +1009,10 @@
         </w:rPr>
         <w:lastRenderedPageBreak/>
         <w:drawing>
-          <wp:inline distT="0" distB="0" distL="0" distR="0" wp14:anchorId="53BA1B76" wp14:editId="0C038F63">
-            <wp:extent cx="7020560" cy="3949065"/>
+          <wp:inline distT="0" distB="0" distL="0" distR="0" wp14:anchorId="717C541C" wp14:editId="1A6648A3">
+            <wp:extent cx="7020560" cy="5735320"/>
             <wp:effectExtent l="0" t="0" r="8890" b="0"/>
-            <wp:docPr id="1493725537" name="Picture 5"/>
+            <wp:docPr id="1806271012" name="Picture 3"/>
             <wp:cNvGraphicFramePr>
               <a:graphicFrameLocks xmlns:a="http://schemas.openxmlformats.org/drawingml/2006/main" noChangeAspect="1"/>
             </wp:cNvGraphicFramePr>
@@ -1160,11 +1020,58 @@
               <a:graphicData uri="http://schemas.openxmlformats.org/drawingml/2006/picture">
                 <pic:pic xmlns:pic="http://schemas.openxmlformats.org/drawingml/2006/picture">
                   <pic:nvPicPr>
-                    <pic:cNvPr id="1493725537" name="Picture 1493725537"/>
+                    <pic:cNvPr id="1806271012" name="Picture 1806271012"/>
                     <pic:cNvPicPr/>
                   </pic:nvPicPr>
                   <pic:blipFill>
-                    <a:blip r:embed="rId16" cstate="print">
+                    <a:blip r:embed="rId16">
+                      <a:extLst>
+                        <a:ext uri="{28A0092B-C50C-407E-A947-70E740481C1C}">
+                          <a14:useLocalDpi xmlns:a14="http://schemas.microsoft.com/office/drawing/2010/main" val="0"/>
+                        </a:ext>
+                      </a:extLst>
+                    </a:blip>
+                    <a:stretch>
+                      <a:fillRect/>
+                    </a:stretch>
+                  </pic:blipFill>
+                  <pic:spPr>
+                    <a:xfrm>
+                      <a:off x="0" y="0"/>
+                      <a:ext cx="7020560" cy="5735320"/>
+                    </a:xfrm>
+                    <a:prstGeom prst="rect">
+                      <a:avLst/>
+                    </a:prstGeom>
+                  </pic:spPr>
+                </pic:pic>
+              </a:graphicData>
+            </a:graphic>
+          </wp:inline>
+        </w:drawing>
+      </w:r>
+      <w:r>
+        <w:rPr>
+          <w:noProof/>
+        </w:rPr>
+        <w:lastRenderedPageBreak/>
+        <w:drawing>
+          <wp:inline distT="0" distB="0" distL="0" distR="0" wp14:anchorId="65A7E2FF" wp14:editId="61A687AB">
+            <wp:extent cx="7020560" cy="3949065"/>
+            <wp:effectExtent l="0" t="0" r="8890" b="0"/>
+            <wp:docPr id="1111435175" name="Picture 4"/>
+            <wp:cNvGraphicFramePr>
+              <a:graphicFrameLocks xmlns:a="http://schemas.openxmlformats.org/drawingml/2006/main" noChangeAspect="1"/>
+            </wp:cNvGraphicFramePr>
+            <a:graphic xmlns:a="http://schemas.openxmlformats.org/drawingml/2006/main">
+              <a:graphicData uri="http://schemas.openxmlformats.org/drawingml/2006/picture">
+                <pic:pic xmlns:pic="http://schemas.openxmlformats.org/drawingml/2006/picture">
+                  <pic:nvPicPr>
+                    <pic:cNvPr id="1111435175" name="Picture 1111435175"/>
+                    <pic:cNvPicPr/>
+                  </pic:nvPicPr>
+                  <pic:blipFill>
+                    <a:blip r:embed="rId17" cstate="print">
                       <a:extLst>
                         <a:ext uri="{28A0092B-C50C-407E-A947-70E740481C1C}">
                           <a14:useLocalDpi xmlns:a14="http://schemas.microsoft.com/office/drawing/2010/main" val="0"/>
@@ -1190,8 +1097,95 @@
           </wp:inline>
         </w:drawing>
       </w:r>
-    </w:p>
+      <w:r>
+        <w:rPr>
+          <w:noProof/>
+        </w:rPr>
+        <w:drawing>
+          <wp:inline distT="0" distB="0" distL="0" distR="0" wp14:anchorId="53BA1B76" wp14:editId="26107D60">
+            <wp:extent cx="7020560" cy="3949065"/>
+            <wp:effectExtent l="0" t="0" r="8890" b="0"/>
+            <wp:docPr id="1493725537" name="Picture 5"/>
+            <wp:cNvGraphicFramePr>
+              <a:graphicFrameLocks xmlns:a="http://schemas.openxmlformats.org/drawingml/2006/main" noChangeAspect="1"/>
+            </wp:cNvGraphicFramePr>
+            <a:graphic xmlns:a="http://schemas.openxmlformats.org/drawingml/2006/main">
+              <a:graphicData uri="http://schemas.openxmlformats.org/drawingml/2006/picture">
+                <pic:pic xmlns:pic="http://schemas.openxmlformats.org/drawingml/2006/picture">
+                  <pic:nvPicPr>
+                    <pic:cNvPr id="1493725537" name="Picture 1493725537"/>
+                    <pic:cNvPicPr/>
+                  </pic:nvPicPr>
+                  <pic:blipFill>
+                    <a:blip r:embed="rId18" cstate="print">
+                      <a:extLst>
+                        <a:ext uri="{28A0092B-C50C-407E-A947-70E740481C1C}">
+                          <a14:useLocalDpi xmlns:a14="http://schemas.microsoft.com/office/drawing/2010/main" val="0"/>
+                        </a:ext>
+                      </a:extLst>
+                    </a:blip>
+                    <a:stretch>
+                      <a:fillRect/>
+                    </a:stretch>
+                  </pic:blipFill>
+                  <pic:spPr>
+                    <a:xfrm>
+                      <a:off x="0" y="0"/>
+                      <a:ext cx="7020560" cy="3949065"/>
+                    </a:xfrm>
+                    <a:prstGeom prst="rect">
+                      <a:avLst/>
+                    </a:prstGeom>
+                  </pic:spPr>
+                </pic:pic>
+              </a:graphicData>
+            </a:graphic>
+          </wp:inline>
+        </w:drawing>
+      </w:r>
+    </w:p>
+    <w:p>
+      <w:r>
+        <w:rPr>
+          <w:b/>
+          <w:bCs/>
+        </w:rPr>
+        <w:t>GitHub Repository Link</w:t>
+      </w:r>
+    </w:p>
+    <w:p>
+      <w:r>
+        <w:t>The complete source code for this experiment is available in the following GitHub repository:</w:t>
+      </w:r>
+    </w:p>
+    <w:p>
+      <w:r>
+        <w:rPr>
+          <w:b/>
+          <w:bCs/>
+        </w:rPr>
+        <w:t>Repository:</w:t>
+      </w:r>
+      <w:r>
+        <w:br/>
+      </w:r>
+      <w:hyperlink r:id="rId19" w:tgtFrame="_new" w:history="1">
+        <w:r>
+          <w:rPr>
+            <w:rStyle w:val="Hyperlink"/>
+          </w:rPr>
+          <w:t>https://github.com/Hareesh-Reddy-9126/2400090155_FSAD_SKILL_11.git</w:t>
+        </w:r>
+      </w:hyperlink>
+    </w:p>
+    <w:p/>
     <w:sectPr>
+      <w:headerReference w:type="even" r:id="rId20"/>
+      <w:headerReference w:type="default" r:id="rId21"/>
+      <w:footerReference w:type="even" r:id="rId22"/>
+      <w:footerReference w:type="default" r:id="rId23"/>
+      <w:headerReference w:type="first" r:id="rId24"/>
+      <w:footerReference w:type="first" r:id="rId25"/>
       <w:pgSz w:w="11906" w:h="16838"/>
       <w:pgMar w:top="426" w:right="424" w:bottom="284" w:left="426" w:header="708" w:footer="708" w:gutter="0"/>
       <w:cols w:space="708"/>
@@ -1199,6 +1193,116 @@
     </w:sectPr>
   </w:body>
 </w:document>
+</file>
+
+<file path=word/endnotes.xml><?xml version="1.0" encoding="utf-8"?>
+<w:endnotes xmlns:wpc="http://schemas.microsoft.com/office/word/2010/wordprocessingCanvas" xmlns:cx="http://schemas.microsoft.com/office/drawing/2014/chartex" xmlns:cx1="http://schemas.microsoft.com/office/drawing/2015/9/8/chartex" xmlns:cx2="http://schemas.microsoft.com/office/drawing/2015/10/21/chartex" xmlns:cx3="http://schemas.microsoft.com/office/drawing/2016/5/9/chartex" xmlns:cx4="http://schemas.microsoft.com/office/drawing/2016/5/10/chartex" xmlns:cx5="http://schemas.microsoft.com/office/drawing/2016/5/11/chartex" xmlns:cx6="http://schemas.microsoft.com/office/drawing/2016/5/12/chartex" xmlns:cx7="http://schemas.microsoft.com/office/drawing/2016/5/13/chartex" xmlns:cx8="http://schemas.microsoft.com/office/drawing/2016/5/14/chartex" xmlns:mc="http://schemas.openxmlformats.org/markup-compatibility/2006" xmlns:aink="http://schemas.microsoft.com/office/drawing/2016/ink" xmlns:am3d="http://schemas.microsoft.com/office/drawing/2017/model3d" xmlns:o="urn:schemas-microsoft-com:office:office" xmlns:oel="http://schemas.microsoft.com/office/2019/extlst" xmlns:r="http://schemas.openxmlformats.org/officeDocument/2006/relationships" xmlns:m="http://schemas.openxmlformats.org/officeDocument/2006/math" xmlns:v="urn:schemas-microsoft-com:vml" xmlns:wp14="http://schemas.microsoft.com/office/word/2010/wordprocessingDrawing" xmlns:wp="http://schemas.openxmlformats.org/drawingml/2006/wordprocessingDrawing" xmlns:w10="urn:schemas-microsoft-com:office:word" xmlns:w="http://schemas.openxmlformats.org/wordprocessingml/2006/main" xmlns:w14="http://schemas.microsoft.com/office/word/2010/wordml" xmlns:w15="http://schemas.microsoft.com/office/word/2012/wordml" xmlns:w16cex="http://schemas.microsoft.com/office/word/2018/wordml/cex" xmlns:w16cid="http://schemas.microsoft.com/office/word/2016/wordml/cid" xmlns:w16="http://schemas.microsoft.com/office/word/2018/wordml" xmlns:w16du="http://schemas.microsoft.com/office/word/2023/wordml/word16du" xmlns:w16sdtdh="http://schemas.microsoft.com/office/word/2020/wordml/sdtdatahash" xmlns:w16sdtfl="http://schemas.microsoft.com/office/word/2024/wordml/sdtformatlock" xmlns:w16se="http://schemas.microsoft.com/office/word/2015/wordml/symex" xmlns:wpg="http://schemas.microsoft.com/office/word/2010/wordprocessingGroup" xmlns:wpi="http://schemas.microsoft.com/office/word/2010/wordprocessingInk" xmlns:wne="http://schemas.microsoft.com/office/word/2006/wordml" xmlns:wps="http://schemas.microsoft.com/office/word/2010/wordprocessingShape" mc:Ignorable="w14 w15 w16se w16cid w16 w16cex w16sdtdh w16sdtfl w16du wp14">
+  <w:endnote w:type="separator" w:id="-1">
+    <w:p>
+      <w:pPr>
+        <w:spacing w:after="0" w:line="240" w:lineRule="auto"/>
+      </w:pPr>
+      <w:r>
+        <w:separator/>
+      </w:r>
+    </w:p>
+  </w:endnote>
+  <w:endnote w:type="continuationSeparator" w:id="0">
+    <w:p>
+      <w:pPr>
+        <w:spacing w:after="0" w:line="240" w:lineRule="auto"/>
+      </w:pPr>
+      <w:r>
+        <w:continuationSeparator/>
+      </w:r>
+    </w:p>
+  </w:endnote>
+</w:endnotes>
+</file>
+
+<file path=word/footer1.xml><?xml version="1.0" encoding="utf-8"?>
+<w:ftr xmlns:wpc="http://schemas.microsoft.com/office/word/2010/wordprocessingCanvas" xmlns:cx="http://schemas.microsoft.com/office/drawing/2014/chartex" xmlns:cx1="http://schemas.microsoft.com/office/drawing/2015/9/8/chartex" xmlns:cx2="http://schemas.microsoft.com/office/drawing/2015/10/21/chartex" xmlns:cx3="http://schemas.microsoft.com/office/drawing/2016/5/9/chartex" xmlns:cx4="http://schemas.microsoft.com/office/drawing/2016/5/10/chartex" xmlns:cx5="http://schemas.microsoft.com/office/drawing/2016/5/11/chartex" xmlns:cx6="http://schemas.microsoft.com/office/drawing/2016/5/12/chartex" xmlns:cx7="http://schemas.microsoft.com/office/drawing/2016/5/13/chartex" xmlns:cx8="http://schemas.microsoft.com/office/drawing/2016/5/14/chartex" xmlns:mc="http://schemas.openxmlformats.org/markup-compatibility/2006" xmlns:aink="http://schemas.microsoft.com/office/drawing/2016/ink" xmlns:am3d="http://schemas.microsoft.com/office/drawing/2017/model3d" xmlns:o="urn:schemas-microsoft-com:office:office" xmlns:oel="http://schemas.microsoft.com/office/2019/extlst" xmlns:r="http://schemas.openxmlformats.org/officeDocument/2006/relationships" xmlns:m="http://schemas.openxmlformats.org/officeDocument/2006/math" xmlns:v="urn:schemas-microsoft-com:vml" xmlns:wp14="http://schemas.microsoft.com/office/word/2010/wordprocessingDrawing" xmlns:wp="http://schemas.openxmlformats.org/drawingml/2006/wordprocessingDrawing" xmlns:w10="urn:schemas-microsoft-com:office:word" xmlns:w="http://schemas.openxmlformats.org/wordprocessingml/2006/main" xmlns:w14="http://schemas.microsoft.com/office/word/2010/wordml" xmlns:w15="http://schemas.microsoft.com/office/word/2012/wordml" xmlns:w16cex="http://schemas.microsoft.com/office/word/2018/wordml/cex" xmlns:w16cid="http://schemas.microsoft.com/office/word/2016/wordml/cid" xmlns:w16="http://schemas.microsoft.com/office/word/2018/wordml" xmlns:w16du="http://schemas.microsoft.com/office/word/2023/wordml/word16du" xmlns:w16sdtdh="http://schemas.microsoft.com/office/word/2020/wordml/sdtdatahash" xmlns:w16sdtfl="http://schemas.microsoft.com/office/word/2024/wordml/sdtformatlock" xmlns:w16se="http://schemas.microsoft.com/office/word/2015/wordml/symex" xmlns:wpg="http://schemas.microsoft.com/office/word/2010/wordprocessingGroup" xmlns:wpi="http://schemas.microsoft.com/office/word/2010/wordprocessingInk" xmlns:wne="http://schemas.microsoft.com/office/word/2006/wordml" xmlns:wps="http://schemas.microsoft.com/office/word/2010/wordprocessingShape" mc:Ignorable="w14 w15 w16se w16cid w16 w16cex w16sdtdh w16sdtfl w16du wp14">
+  <w:p>
+    <w:pPr>
+      <w:pStyle w:val="Footer"/>
+    </w:pPr>
+  </w:p>
+</w:ftr>
+</file>
+
+<file path=word/footer2.xml><?xml version="1.0" encoding="utf-8"?>
+<w:ftr xmlns:wpc="http://schemas.microsoft.com/office/word/2010/wordprocessingCanvas" xmlns:cx="http://schemas.microsoft.com/office/drawing/2014/chartex" xmlns:cx1="http://schemas.microsoft.com/office/drawing/2015/9/8/chartex" xmlns:cx2="http://schemas.microsoft.com/office/drawing/2015/10/21/chartex" xmlns:cx3="http://schemas.microsoft.com/office/drawing/2016/5/9/chartex" xmlns:cx4="http://schemas.microsoft.com/office/drawing/2016/5/10/chartex" xmlns:cx5="http://schemas.microsoft.com/office/drawing/2016/5/11/chartex" xmlns:cx6="http://schemas.microsoft.com/office/drawing/2016/5/12/chartex" xmlns:cx7="http://schemas.microsoft.com/office/drawing/2016/5/13/chartex" xmlns:cx8="http://schemas.microsoft.com/office/drawing/2016/5/14/chartex" xmlns:mc="http://schemas.openxmlformats.org/markup-compatibility/2006" xmlns:aink="http://schemas.microsoft.com/office/drawing/2016/ink" xmlns:am3d="http://schemas.microsoft.com/office/drawing/2017/model3d" xmlns:o="urn:schemas-microsoft-com:office:office" xmlns:oel="http://schemas.microsoft.com/office/2019/extlst" xmlns:r="http://schemas.openxmlformats.org/officeDocument/2006/relationships" xmlns:m="http://schemas.openxmlformats.org/officeDocument/2006/math" xmlns:v="urn:schemas-microsoft-com:vml" xmlns:wp14="http://schemas.microsoft.com/office/word/2010/wordprocessingDrawing" xmlns:wp="http://schemas.openxmlformats.org/drawingml/2006/wordprocessingDrawing" xmlns:w10="urn:schemas-microsoft-com:office:word" xmlns:w="http://schemas.openxmlformats.org/wordprocessingml/2006/main" xmlns:w14="http://schemas.microsoft.com/office/word/2010/wordml" xmlns:w15="http://schemas.microsoft.com/office/word/2012/wordml" xmlns:w16cex="http://schemas.microsoft.com/office/word/2018/wordml/cex" xmlns:w16cid="http://schemas.microsoft.com/office/word/2016/wordml/cid" xmlns:w16="http://schemas.microsoft.com/office/word/2018/wordml" xmlns:w16du="http://schemas.microsoft.com/office/word/2023/wordml/word16du" xmlns:w16sdtdh="http://schemas.microsoft.com/office/word/2020/wordml/sdtdatahash" xmlns:w16sdtfl="http://schemas.microsoft.com/office/word/2024/wordml/sdtformatlock" xmlns:w16se="http://schemas.microsoft.com/office/word/2015/wordml/symex" xmlns:wpg="http://schemas.microsoft.com/office/word/2010/wordprocessingGroup" xmlns:wpi="http://schemas.microsoft.com/office/word/2010/wordprocessingInk" xmlns:wne="http://schemas.microsoft.com/office/word/2006/wordml" xmlns:wps="http://schemas.microsoft.com/office/word/2010/wordprocessingShape" mc:Ignorable="w14 w15 w16se w16cid w16 w16cex w16sdtdh w16sdtfl w16du wp14">
+  <w:p>
+    <w:pPr>
+      <w:pStyle w:val="Footer"/>
+    </w:pPr>
+  </w:p>
+</w:ftr>
+</file>
+
+<file path=word/footer3.xml><?xml version="1.0" encoding="utf-8"?>
+<w:ftr xmlns:wpc="http://schemas.microsoft.com/office/word/2010/wordprocessingCanvas" xmlns:cx="http://schemas.microsoft.com/office/drawing/2014/chartex" xmlns:cx1="http://schemas.microsoft.com/office/drawing/2015/9/8/chartex" xmlns:cx2="http://schemas.microsoft.com/office/drawing/2015/10/21/chartex" xmlns:cx3="http://schemas.microsoft.com/office/drawing/2016/5/9/chartex" xmlns:cx4="http://schemas.microsoft.com/office/drawing/2016/5/10/chartex" xmlns:cx5="http://schemas.microsoft.com/office/drawing/2016/5/11/chartex" xmlns:cx6="http://schemas.microsoft.com/office/drawing/2016/5/12/chartex" xmlns:cx7="http://schemas.microsoft.com/office/drawing/2016/5/13/chartex" xmlns:cx8="http://schemas.microsoft.com/office/drawing/2016/5/14/chartex" xmlns:mc="http://schemas.openxmlformats.org/markup-compatibility/2006" xmlns:aink="http://schemas.microsoft.com/office/drawing/2016/ink" xmlns:am3d="http://schemas.microsoft.com/office/drawing/2017/model3d" xmlns:o="urn:schemas-microsoft-com:office:office" xmlns:oel="http://schemas.microsoft.com/office/2019/extlst" xmlns:r="http://schemas.openxmlformats.org/officeDocument/2006/relationships" xmlns:m="http://schemas.openxmlformats.org/officeDocument/2006/math" xmlns:v="urn:schemas-microsoft-com:vml" xmlns:wp14="http://schemas.microsoft.com/office/word/2010/wordprocessingDrawing" xmlns:wp="http://schemas.openxmlformats.org/drawingml/2006/wordprocessingDrawing" xmlns:w10="urn:schemas-microsoft-com:office:word" xmlns:w="http://schemas.openxmlformats.org/wordprocessingml/2006/main" xmlns:w14="http://schemas.microsoft.com/office/word/2010/wordml" xmlns:w15="http://schemas.microsoft.com/office/word/2012/wordml" xmlns:w16cex="http://schemas.microsoft.com/office/word/2018/wordml/cex" xmlns:w16cid="http://schemas.microsoft.com/office/word/2016/wordml/cid" xmlns:w16="http://schemas.microsoft.com/office/word/2018/wordml" xmlns:w16du="http://schemas.microsoft.com/office/word/2023/wordml/word16du" xmlns:w16sdtdh="http://schemas.microsoft.com/office/word/2020/wordml/sdtdatahash" xmlns:w16sdtfl="http://schemas.microsoft.com/office/word/2024/wordml/sdtformatlock" xmlns:w16se="http://schemas.microsoft.com/office/word/2015/wordml/symex" xmlns:wpg="http://schemas.microsoft.com/office/word/2010/wordprocessingGroup" xmlns:wpi="http://schemas.microsoft.com/office/word/2010/wordprocessingInk" xmlns:wne="http://schemas.microsoft.com/office/word/2006/wordml" xmlns:wps="http://schemas.microsoft.com/office/word/2010/wordprocessingShape" mc:Ignorable="w14 w15 w16se w16cid w16 w16cex w16sdtdh w16sdtfl w16du wp14">
+  <w:p>
+    <w:pPr>
+      <w:pStyle w:val="Footer"/>
+    </w:pPr>
+  </w:p>
+</w:ftr>
+</file>
+
+<file path=word/footnotes.xml><?xml version="1.0" encoding="utf-8"?>
+<w:footnotes xmlns:wpc="http://schemas.microsoft.com/office/word/2010/wordprocessingCanvas" xmlns:cx="http://schemas.microsoft.com/office/drawing/2014/chartex" xmlns:cx1="http://schemas.microsoft.com/office/drawing/2015/9/8/chartex" xmlns:cx2="http://schemas.microsoft.com/office/drawing/2015/10/21/chartex" xmlns:cx3="http://schemas.microsoft.com/office/drawing/2016/5/9/chartex" xmlns:cx4="http://schemas.microsoft.com/office/drawing/2016/5/10/chartex" xmlns:cx5="http://schemas.microsoft.com/office/drawing/2016/5/11/chartex" xmlns:cx6="http://schemas.microsoft.com/office/drawing/2016/5/12/chartex" xmlns:cx7="http://schemas.microsoft.com/office/drawing/2016/5/13/chartex" xmlns:cx8="http://schemas.microsoft.com/office/drawing/2016/5/14/chartex" xmlns:mc="http://schemas.openxmlformats.org/markup-compatibility/2006" xmlns:aink="http://schemas.microsoft.com/office/drawing/2016/ink" xmlns:am3d="http://schemas.microsoft.com/office/drawing/2017/model3d" xmlns:o="urn:schemas-microsoft-com:office:office" xmlns:oel="http://schemas.microsoft.com/office/2019/extlst" xmlns:r="http://schemas.openxmlformats.org/officeDocument/2006/relationships" xmlns:m="http://schemas.openxmlformats.org/officeDocument/2006/math" xmlns:v="urn:schemas-microsoft-com:vml" xmlns:wp14="http://schemas.microsoft.com/office/word/2010/wordprocessingDrawing" xmlns:wp="http://schemas.openxmlformats.org/drawingml/2006/wordprocessingDrawing" xmlns:w10="urn:schemas-microsoft-com:office:word" xmlns:w="http://schemas.openxmlformats.org/wordprocessingml/2006/main" xmlns:w14="http://schemas.microsoft.com/office/word/2010/wordml" xmlns:w15="http://schemas.microsoft.com/office/word/2012/wordml" xmlns:w16cex="http://schemas.microsoft.com/office/word/2018/wordml/cex" xmlns:w16cid="http://schemas.microsoft.com/office/word/2016/wordml/cid" xmlns:w16="http://schemas.microsoft.com/office/word/2018/wordml" xmlns:w16du="http://schemas.microsoft.com/office/word/2023/wordml/word16du" xmlns:w16sdtdh="http://schemas.microsoft.com/office/word/2020/wordml/sdtdatahash" xmlns:w16sdtfl="http://schemas.microsoft.com/office/word/2024/wordml/sdtformatlock" xmlns:w16se="http://schemas.microsoft.com/office/word/2015/wordml/symex" xmlns:wpg="http://schemas.microsoft.com/office/word/2010/wordprocessingGroup" xmlns:wpi="http://schemas.microsoft.com/office/word/2010/wordprocessingInk" xmlns:wne="http://schemas.microsoft.com/office/word/2006/wordml" xmlns:wps="http://schemas.microsoft.com/office/word/2010/wordprocessingShape" mc:Ignorable="w14 w15 w16se w16cid w16 w16cex w16sdtdh w16sdtfl w16du wp14">
+  <w:footnote w:type="separator" w:id="-1">
+    <w:p>
+      <w:pPr>
+        <w:spacing w:after="0" w:line="240" w:lineRule="auto"/>
+      </w:pPr>
+      <w:r>
+        <w:separator/>
+      </w:r>
+    </w:p>
+  </w:footnote>
+  <w:footnote w:type="continuationSeparator" w:id="0">
+    <w:p>
+      <w:pPr>
+        <w:spacing w:after="0" w:line="240" w:lineRule="auto"/>
+      </w:pPr>
+      <w:r>
+        <w:continuationSeparator/>
+      </w:r>
+    </w:p>
+  </w:footnote>
+</w:footnotes>
+</file>
+
+<file path=word/header1.xml><?xml version="1.0" encoding="utf-8"?>
+<w:hdr xmlns:wpc="http://schemas.microsoft.com/office/word/2010/wordprocessingCanvas" xmlns:cx="http://schemas.microsoft.com/office/drawing/2014/chartex" xmlns:cx1="http://schemas.microsoft.com/office/drawing/2015/9/8/chartex" xmlns:cx2="http://schemas.microsoft.com/office/drawing/2015/10/21/chartex" xmlns:cx3="http://schemas.microsoft.com/office/drawing/2016/5/9/chartex" xmlns:cx4="http://schemas.microsoft.com/office/drawing/2016/5/10/chartex" xmlns:cx5="http://schemas.microsoft.com/office/drawing/2016/5/11/chartex" xmlns:cx6="http://schemas.microsoft.com/office/drawing/2016/5/12/chartex" xmlns:cx7="http://schemas.microsoft.com/office/drawing/2016/5/13/chartex" xmlns:cx8="http://schemas.microsoft.com/office/drawing/2016/5/14/chartex" xmlns:mc="http://schemas.openxmlformats.org/markup-compatibility/2006" xmlns:aink="http://schemas.microsoft.com/office/drawing/2016/ink" xmlns:am3d="http://schemas.microsoft.com/office/drawing/2017/model3d" xmlns:o="urn:schemas-microsoft-com:office:office" xmlns:oel="http://schemas.microsoft.com/office/2019/extlst" xmlns:r="http://schemas.openxmlformats.org/officeDocument/2006/relationships" xmlns:m="http://schemas.openxmlformats.org/officeDocument/2006/math" xmlns:v="urn:schemas-microsoft-com:vml" xmlns:wp14="http://schemas.microsoft.com/office/word/2010/wordprocessingDrawing" xmlns:wp="http://schemas.openxmlformats.org/drawingml/2006/wordprocessingDrawing" xmlns:w10="urn:schemas-microsoft-com:office:word" xmlns:w="http://schemas.openxmlformats.org/wordprocessingml/2006/main" xmlns:w14="http://schemas.microsoft.com/office/word/2010/wordml" xmlns:w15="http://schemas.microsoft.com/office/word/2012/wordml" xmlns:w16cex="http://schemas.microsoft.com/office/word/2018/wordml/cex" xmlns:w16cid="http://schemas.microsoft.com/office/word/2016/wordml/cid" xmlns:w16="http://schemas.microsoft.com/office/word/2018/wordml" xmlns:w16du="http://schemas.microsoft.com/office/word/2023/wordml/word16du" xmlns:w16sdtdh="http://schemas.microsoft.com/office/word/2020/wordml/sdtdatahash" xmlns:w16sdtfl="http://schemas.microsoft.com/office/word/2024/wordml/sdtformatlock" xmlns:w16se="http://schemas.microsoft.com/office/word/2015/wordml/symex" xmlns:wpg="http://schemas.microsoft.com/office/word/2010/wordprocessingGroup" xmlns:wpi="http://schemas.microsoft.com/office/word/2010/wordprocessingInk" xmlns:wne="http://schemas.microsoft.com/office/word/2006/wordml" xmlns:wps="http://schemas.microsoft.com/office/word/2010/wordprocessingShape" mc:Ignorable="w14 w15 w16se w16cid w16 w16cex w16sdtdh w16sdtfl w16du wp14">
+  <w:p>
+    <w:pPr>
+      <w:pStyle w:val="Header"/>
+    </w:pPr>
+  </w:p>
+</w:hdr>
+</file>
+
+<file path=word/header2.xml><?xml version="1.0" encoding="utf-8"?>
+<w:hdr xmlns:wpc="http://schemas.microsoft.com/office/word/2010/wordprocessingCanvas" xmlns:cx="http://schemas.microsoft.com/office/drawing/2014/chartex" xmlns:cx1="http://schemas.microsoft.com/office/drawing/2015/9/8/chartex" xmlns:cx2="http://schemas.microsoft.com/office/drawing/2015/10/21/chartex" xmlns:cx3="http://schemas.microsoft.com/office/drawing/2016/5/9/chartex" xmlns:cx4="http://schemas.microsoft.com/office/drawing/2016/5/10/chartex" xmlns:cx5="http://schemas.microsoft.com/office/drawing/2016/5/11/chartex" xmlns:cx6="http://schemas.microsoft.com/office/drawing/2016/5/12/chartex" xmlns:cx7="http://schemas.microsoft.com/office/drawing/2016/5/13/chartex" xmlns:cx8="http://schemas.microsoft.com/office/drawing/2016/5/14/chartex" xmlns:mc="http://schemas.openxmlformats.org/markup-compatibility/2006" xmlns:aink="http://schemas.microsoft.com/office/drawing/2016/ink" xmlns:am3d="http://schemas.microsoft.com/office/drawing/2017/model3d" xmlns:o="urn:schemas-microsoft-com:office:office" xmlns:oel="http://schemas.microsoft.com/office/2019/extlst" xmlns:r="http://schemas.openxmlformats.org/officeDocument/2006/relationships" xmlns:m="http://schemas.openxmlformats.org/officeDocument/2006/math" xmlns:v="urn:schemas-microsoft-com:vml" xmlns:wp14="http://schemas.microsoft.com/office/word/2010/wordprocessingDrawing" xmlns:wp="http://schemas.openxmlformats.org/drawingml/2006/wordprocessingDrawing" xmlns:w10="urn:schemas-microsoft-com:office:word" xmlns:w="http://schemas.openxmlformats.org/wordprocessingml/2006/main" xmlns:w14="http://schemas.microsoft.com/office/word/2010/wordml" xmlns:w15="http://schemas.microsoft.com/office/word/2012/wordml" xmlns:w16cex="http://schemas.microsoft.com/office/word/2018/wordml/cex" xmlns:w16cid="http://schemas.microsoft.com/office/word/2016/wordml/cid" xmlns:w16="http://schemas.microsoft.com/office/word/2018/wordml" xmlns:w16du="http://schemas.microsoft.com/office/word/2023/wordml/word16du" xmlns:w16sdtdh="http://schemas.microsoft.com/office/word/2020/wordml/sdtdatahash" xmlns:w16sdtfl="http://schemas.microsoft.com/office/word/2024/wordml/sdtformatlock" xmlns:w16se="http://schemas.microsoft.com/office/word/2015/wordml/symex" xmlns:wpg="http://schemas.microsoft.com/office/word/2010/wordprocessingGroup" xmlns:wpi="http://schemas.microsoft.com/office/word/2010/wordprocessingInk" xmlns:wne="http://schemas.microsoft.com/office/word/2006/wordml" xmlns:wps="http://schemas.microsoft.com/office/word/2010/wordprocessingShape" mc:Ignorable="w14 w15 w16se w16cid w16 w16cex w16sdtdh w16sdtfl w16du wp14">
+  <w:p>
+    <w:pPr>
+      <w:pStyle w:val="Header"/>
+    </w:pPr>
+  </w:p>
+</w:hdr>
+</file>
+
+<file path=word/header3.xml><?xml version="1.0" encoding="utf-8"?>
+<w:hdr xmlns:wpc="http://schemas.microsoft.com/office/word/2010/wordprocessingCanvas" xmlns:cx="http://schemas.microsoft.com/office/drawing/2014/chartex" xmlns:cx1="http://schemas.microsoft.com/office/drawing/2015/9/8/chartex" xmlns:cx2="http://schemas.microsoft.com/office/drawing/2015/10/21/chartex" xmlns:cx3="http://schemas.microsoft.com/office/drawing/2016/5/9/chartex" xmlns:cx4="http://schemas.microsoft.com/office/drawing/2016/5/10/chartex" xmlns:cx5="http://schemas.microsoft.com/office/drawing/2016/5/11/chartex" xmlns:cx6="http://schemas.microsoft.com/office/drawing/2016/5/12/chartex" xmlns:cx7="http://schemas.microsoft.com/office/drawing/2016/5/13/chartex" xmlns:cx8="http://schemas.microsoft.com/office/drawing/2016/5/14/chartex" xmlns:mc="http://schemas.openxmlformats.org/markup-compatibility/2006" xmlns:aink="http://schemas.microsoft.com/office/drawing/2016/ink" xmlns:am3d="http://schemas.microsoft.com/office/drawing/2017/model3d" xmlns:o="urn:schemas-microsoft-com:office:office" xmlns:oel="http://schemas.microsoft.com/office/2019/extlst" xmlns:r="http://schemas.openxmlformats.org/officeDocument/2006/relationships" xmlns:m="http://schemas.openxmlformats.org/officeDocument/2006/math" xmlns:v="urn:schemas-microsoft-com:vml" xmlns:wp14="http://schemas.microsoft.com/office/word/2010/wordprocessingDrawing" xmlns:wp="http://schemas.openxmlformats.org/drawingml/2006/wordprocessingDrawing" xmlns:w10="urn:schemas-microsoft-com:office:word" xmlns:w="http://schemas.openxmlformats.org/wordprocessingml/2006/main" xmlns:w14="http://schemas.microsoft.com/office/word/2010/wordml" xmlns:w15="http://schemas.microsoft.com/office/word/2012/wordml" xmlns:w16cex="http://schemas.microsoft.com/office/word/2018/wordml/cex" xmlns:w16cid="http://schemas.microsoft.com/office/word/2016/wordml/cid" xmlns:w16="http://schemas.microsoft.com/office/word/2018/wordml" xmlns:w16du="http://schemas.microsoft.com/office/word/2023/wordml/word16du" xmlns:w16sdtdh="http://schemas.microsoft.com/office/word/2020/wordml/sdtdatahash" xmlns:w16sdtfl="http://schemas.microsoft.com/office/word/2024/wordml/sdtformatlock" xmlns:w16se="http://schemas.microsoft.com/office/word/2015/wordml/symex" xmlns:wpg="http://schemas.microsoft.com/office/word/2010/wordprocessingGroup" xmlns:wpi="http://schemas.microsoft.com/office/word/2010/wordprocessingInk" xmlns:wne="http://schemas.microsoft.com/office/word/2006/wordml" xmlns:wps="http://schemas.microsoft.com/office/word/2010/wordprocessingShape" mc:Ignorable="w14 w15 w16se w16cid w16 w16cex w16sdtdh w16sdtfl w16du wp14">
+  <w:p>
+    <w:pPr>
+      <w:pStyle w:val="Header"/>
+    </w:pPr>
+  </w:p>
+</w:hdr>
 </file>
 
 <file path=word/numbering.xml><?xml version="1.0" encoding="utf-8"?>
@@ -3025,6 +3129,7 @@
   <w:style w:type="character" w:default="1" w:styleId="DefaultParagraphFont">
     <w:name w:val="Default Paragraph Font"/>
     <w:uiPriority w:val="1"/>
+    <w:semiHidden/>
     <w:unhideWhenUsed/>
   </w:style>
   <w:style w:type="table" w:default="1" w:styleId="TableNormal">
@@ -3361,6 +3466,50 @@
       <w:shd w:val="clear" w:color="auto" w:fill="E1DFDD"/>
     </w:rPr>
   </w:style>
+  <w:style w:type="paragraph" w:styleId="Header">
+    <w:name w:val="header"/>
+    <w:basedOn w:val="Normal"/>
+    <w:link w:val="HeaderChar"/>
+    <w:uiPriority w:val="99"/>
+    <w:unhideWhenUsed/>
+    <w:rsid w:val="00101F78"/>
+    <w:pPr>
+      <w:tabs>
+        <w:tab w:val="center" w:pos="4513"/>
+        <w:tab w:val="right" w:pos="9026"/>
+      </w:tabs>
+      <w:spacing w:after="0" w:line="240" w:lineRule="auto"/>
+    </w:pPr>
+  </w:style>
+  <w:style w:type="character" w:customStyle="1" w:styleId="HeaderChar">
+    <w:name w:val="Header Char"/>
+    <w:basedOn w:val="DefaultParagraphFont"/>
+    <w:link w:val="Header"/>
+    <w:uiPriority w:val="99"/>
+    <w:rsid w:val="00101F78"/>
+  </w:style>
+  <w:style w:type="paragraph" w:styleId="Footer">
+    <w:name w:val="footer"/>
+    <w:basedOn w:val="Normal"/>
+    <w:link w:val="FooterChar"/>
+    <w:uiPriority w:val="99"/>
+    <w:unhideWhenUsed/>
+    <w:rsid w:val="00101F78"/>
+    <w:pPr>
+      <w:tabs>
+        <w:tab w:val="center" w:pos="4513"/>
+        <w:tab w:val="right" w:pos="9026"/>
+      </w:tabs>
+      <w:spacing w:after="0" w:line="240" w:lineRule="auto"/>
+    </w:pPr>
+  </w:style>
+  <w:style w:type="character" w:customStyle="1" w:styleId="FooterChar">
+    <w:name w:val="Footer Char"/>
+    <w:basedOn w:val="DefaultParagraphFont"/>
+    <w:link w:val="Footer"/>
+    <w:uiPriority w:val="99"/>
+    <w:rsid w:val="00101F78"/>
+  </w:style>
 </w:styles>
 </file>
 

</xml_diff>